<commit_message>
fix: report hw 2 screenshots
</commit_message>
<xml_diff>
--- a/J3210/Муртазалиев Матвей/homeworks/hw 2/Отчет.docx
+++ b/J3210/Муртазалиев Матвей/homeworks/hw 2/Отчет.docx
@@ -183,15 +183,7 @@
           <w:sz w:val="36"/>
           <w:szCs w:val="36"/>
         </w:rPr>
-        <w:t>Домашняя</w:t>
-      </w:r>
-      <w:r>
-        <w:rPr>
-          <w:rFonts w:ascii="Times New Roman" w:hAnsi="Times New Roman"/>
-          <w:sz w:val="36"/>
-          <w:szCs w:val="36"/>
-        </w:rPr>
-        <w:t xml:space="preserve"> работа</w:t>
+        <w:t>Домашняя работа</w:t>
       </w:r>
       <w:r>
         <w:rPr>
@@ -650,25 +642,7 @@
           <w:sz w:val="28"/>
           <w:szCs w:val="28"/>
         </w:rPr>
-        <w:t xml:space="preserve">Улучшить доступность ранее реализованного сайта </w:t>
-      </w:r>
-      <w:proofErr w:type="spellStart"/>
-      <w:r>
-        <w:rPr>
-          <w:rFonts w:ascii="Times New Roman" w:hAnsi="Times New Roman"/>
-          <w:sz w:val="28"/>
-          <w:szCs w:val="28"/>
-        </w:rPr>
-        <w:t>FinFlow</w:t>
-      </w:r>
-      <w:proofErr w:type="spellEnd"/>
-      <w:r>
-        <w:rPr>
-          <w:rFonts w:ascii="Times New Roman" w:hAnsi="Times New Roman"/>
-          <w:sz w:val="28"/>
-          <w:szCs w:val="28"/>
-        </w:rPr>
-        <w:t xml:space="preserve"> из </w:t>
+        <w:t xml:space="preserve">Улучшить доступность ранее реализованного сайта FinFlow из </w:t>
       </w:r>
       <w:r>
         <w:rPr>
@@ -700,25 +674,7 @@
           <w:sz w:val="28"/>
           <w:szCs w:val="28"/>
         </w:rPr>
-        <w:t xml:space="preserve">, а затем проверить результат через инструменты браузера и Google </w:t>
-      </w:r>
-      <w:proofErr w:type="spellStart"/>
-      <w:r>
-        <w:rPr>
-          <w:rFonts w:ascii="Times New Roman" w:hAnsi="Times New Roman"/>
-          <w:sz w:val="28"/>
-          <w:szCs w:val="28"/>
-        </w:rPr>
-        <w:t>Lighthouse</w:t>
-      </w:r>
-      <w:proofErr w:type="spellEnd"/>
-      <w:r>
-        <w:rPr>
-          <w:rFonts w:ascii="Times New Roman" w:hAnsi="Times New Roman"/>
-          <w:sz w:val="28"/>
-          <w:szCs w:val="28"/>
-        </w:rPr>
-        <w:t>.</w:t>
+        <w:t>, а затем проверить результат через инструменты браузера и Google Lighthouse.</w:t>
       </w:r>
     </w:p>
     <w:p>
@@ -929,61 +885,7 @@
           <w:sz w:val="28"/>
           <w:szCs w:val="28"/>
         </w:rPr>
-        <w:t xml:space="preserve"> текущую разметку и выделил типовые проблемы доступности. На страницах не хватало </w:t>
-      </w:r>
-      <w:proofErr w:type="spellStart"/>
-      <w:r>
-        <w:rPr>
-          <w:rFonts w:ascii="Times New Roman" w:eastAsia="Times New Roman" w:hAnsi="Times New Roman" w:cs="Times New Roman"/>
-          <w:sz w:val="28"/>
-          <w:szCs w:val="28"/>
-        </w:rPr>
-        <w:t>skip-link</w:t>
-      </w:r>
-      <w:proofErr w:type="spellEnd"/>
-      <w:r>
-        <w:rPr>
-          <w:rFonts w:ascii="Times New Roman" w:eastAsia="Times New Roman" w:hAnsi="Times New Roman" w:cs="Times New Roman"/>
-          <w:sz w:val="28"/>
-          <w:szCs w:val="28"/>
-        </w:rPr>
-        <w:t xml:space="preserve"> для перехода к основному контенту, не везде были навигационные </w:t>
-      </w:r>
-      <w:proofErr w:type="spellStart"/>
-      <w:r>
-        <w:rPr>
-          <w:rFonts w:ascii="Times New Roman" w:eastAsia="Times New Roman" w:hAnsi="Times New Roman" w:cs="Times New Roman"/>
-          <w:sz w:val="28"/>
-          <w:szCs w:val="28"/>
-        </w:rPr>
-        <w:t>landmark</w:t>
-      </w:r>
-      <w:proofErr w:type="spellEnd"/>
-      <w:r>
-        <w:rPr>
-          <w:rFonts w:ascii="Times New Roman" w:eastAsia="Times New Roman" w:hAnsi="Times New Roman" w:cs="Times New Roman"/>
-          <w:sz w:val="28"/>
-          <w:szCs w:val="28"/>
-        </w:rPr>
-        <w:t xml:space="preserve">-области, у активных пунктов меню отсутствовал </w:t>
-      </w:r>
-      <w:proofErr w:type="spellStart"/>
-      <w:r>
-        <w:rPr>
-          <w:rFonts w:ascii="Times New Roman" w:eastAsia="Times New Roman" w:hAnsi="Times New Roman" w:cs="Times New Roman"/>
-          <w:sz w:val="28"/>
-          <w:szCs w:val="28"/>
-        </w:rPr>
-        <w:t>aria-current</w:t>
-      </w:r>
-      <w:proofErr w:type="spellEnd"/>
-      <w:r>
-        <w:rPr>
-          <w:rFonts w:ascii="Times New Roman" w:eastAsia="Times New Roman" w:hAnsi="Times New Roman" w:cs="Times New Roman"/>
-          <w:sz w:val="28"/>
-          <w:szCs w:val="28"/>
-        </w:rPr>
-        <w:t xml:space="preserve">, декоративные иконки не были скрыты от </w:t>
+        <w:t xml:space="preserve"> текущую разметку и выделил типовые проблемы доступности. На страницах не хватало skip-link для перехода к основному контенту, не везде были навигационные landmark-области, у активных пунктов меню отсутствовал aria-current, декоративные иконки не были скрыты от </w:t>
       </w:r>
       <w:r>
         <w:rPr>
@@ -999,18 +901,8 @@
           <w:sz w:val="28"/>
           <w:szCs w:val="28"/>
         </w:rPr>
-        <w:t xml:space="preserve">, а динамические уведомления не были оформлены как </w:t>
-      </w:r>
-      <w:proofErr w:type="spellStart"/>
-      <w:r>
-        <w:rPr>
-          <w:rFonts w:ascii="Times New Roman" w:eastAsia="Times New Roman" w:hAnsi="Times New Roman" w:cs="Times New Roman"/>
-          <w:sz w:val="28"/>
-          <w:szCs w:val="28"/>
-        </w:rPr>
-        <w:t>live-region</w:t>
-      </w:r>
-      <w:proofErr w:type="spellEnd"/>
+        <w:t>, а динамические уведомления не были оформлены как live-region</w:t>
+      </w:r>
     </w:p>
     <w:p>
       <w:pPr>
@@ -1036,61 +928,7 @@
           <w:sz w:val="28"/>
           <w:szCs w:val="28"/>
         </w:rPr>
-        <w:t xml:space="preserve">) После этого добавил общие улучшения для всех страниц. Перед основным контентом появился </w:t>
-      </w:r>
-      <w:proofErr w:type="spellStart"/>
-      <w:r>
-        <w:rPr>
-          <w:rFonts w:ascii="Times New Roman" w:eastAsia="Times New Roman" w:hAnsi="Times New Roman" w:cs="Times New Roman"/>
-          <w:sz w:val="28"/>
-          <w:szCs w:val="28"/>
-        </w:rPr>
-        <w:t>skip-link</w:t>
-      </w:r>
-      <w:proofErr w:type="spellEnd"/>
-      <w:r>
-        <w:rPr>
-          <w:rFonts w:ascii="Times New Roman" w:eastAsia="Times New Roman" w:hAnsi="Times New Roman" w:cs="Times New Roman"/>
-          <w:sz w:val="28"/>
-          <w:szCs w:val="28"/>
-        </w:rPr>
-        <w:t xml:space="preserve">, у тега </w:t>
-      </w:r>
-      <w:proofErr w:type="spellStart"/>
-      <w:r>
-        <w:rPr>
-          <w:rFonts w:ascii="Times New Roman" w:eastAsia="Times New Roman" w:hAnsi="Times New Roman" w:cs="Times New Roman"/>
-          <w:sz w:val="28"/>
-          <w:szCs w:val="28"/>
-        </w:rPr>
-        <w:t>main</w:t>
-      </w:r>
-      <w:proofErr w:type="spellEnd"/>
-      <w:r>
-        <w:rPr>
-          <w:rFonts w:ascii="Times New Roman" w:eastAsia="Times New Roman" w:hAnsi="Times New Roman" w:cs="Times New Roman"/>
-          <w:sz w:val="28"/>
-          <w:szCs w:val="28"/>
-        </w:rPr>
-        <w:t xml:space="preserve"> появился стабильный </w:t>
-      </w:r>
-      <w:proofErr w:type="spellStart"/>
-      <w:r>
-        <w:rPr>
-          <w:rFonts w:ascii="Times New Roman" w:eastAsia="Times New Roman" w:hAnsi="Times New Roman" w:cs="Times New Roman"/>
-          <w:sz w:val="28"/>
-          <w:szCs w:val="28"/>
-        </w:rPr>
-        <w:t>id</w:t>
-      </w:r>
-      <w:proofErr w:type="spellEnd"/>
-      <w:r>
-        <w:rPr>
-          <w:rFonts w:ascii="Times New Roman" w:eastAsia="Times New Roman" w:hAnsi="Times New Roman" w:cs="Times New Roman"/>
-          <w:sz w:val="28"/>
-          <w:szCs w:val="28"/>
-        </w:rPr>
-        <w:t xml:space="preserve"> для перехода, у навигации и </w:t>
+        <w:t xml:space="preserve">) После этого добавил общие улучшения для всех страниц. Перед основным контентом появился skip-link, у тега main появился стабильный id для перехода, у навигации и </w:t>
       </w:r>
       <w:r>
         <w:rPr>
@@ -1106,61 +944,7 @@
           <w:sz w:val="28"/>
           <w:szCs w:val="28"/>
         </w:rPr>
-        <w:t xml:space="preserve"> появились понятные </w:t>
-      </w:r>
-      <w:proofErr w:type="spellStart"/>
-      <w:r>
-        <w:rPr>
-          <w:rFonts w:ascii="Times New Roman" w:eastAsia="Times New Roman" w:hAnsi="Times New Roman" w:cs="Times New Roman"/>
-          <w:sz w:val="28"/>
-          <w:szCs w:val="28"/>
-        </w:rPr>
-        <w:t>aria-label</w:t>
-      </w:r>
-      <w:proofErr w:type="spellEnd"/>
-      <w:r>
-        <w:rPr>
-          <w:rFonts w:ascii="Times New Roman" w:eastAsia="Times New Roman" w:hAnsi="Times New Roman" w:cs="Times New Roman"/>
-          <w:sz w:val="28"/>
-          <w:szCs w:val="28"/>
-        </w:rPr>
-        <w:t xml:space="preserve">, а у текущих ссылок в меню и в блоках авторизации был добавлен </w:t>
-      </w:r>
-      <w:proofErr w:type="spellStart"/>
-      <w:r>
-        <w:rPr>
-          <w:rFonts w:ascii="Times New Roman" w:eastAsia="Times New Roman" w:hAnsi="Times New Roman" w:cs="Times New Roman"/>
-          <w:sz w:val="28"/>
-          <w:szCs w:val="28"/>
-        </w:rPr>
-        <w:t>aria-current</w:t>
-      </w:r>
-      <w:proofErr w:type="spellEnd"/>
-      <w:r>
-        <w:rPr>
-          <w:rFonts w:ascii="Times New Roman" w:eastAsia="Times New Roman" w:hAnsi="Times New Roman" w:cs="Times New Roman"/>
-          <w:sz w:val="28"/>
-          <w:szCs w:val="28"/>
-        </w:rPr>
-        <w:t>="</w:t>
-      </w:r>
-      <w:proofErr w:type="spellStart"/>
-      <w:r>
-        <w:rPr>
-          <w:rFonts w:ascii="Times New Roman" w:eastAsia="Times New Roman" w:hAnsi="Times New Roman" w:cs="Times New Roman"/>
-          <w:sz w:val="28"/>
-          <w:szCs w:val="28"/>
-        </w:rPr>
-        <w:t>page</w:t>
-      </w:r>
-      <w:proofErr w:type="spellEnd"/>
-      <w:r>
-        <w:rPr>
-          <w:rFonts w:ascii="Times New Roman" w:eastAsia="Times New Roman" w:hAnsi="Times New Roman" w:cs="Times New Roman"/>
-          <w:sz w:val="28"/>
-          <w:szCs w:val="28"/>
-        </w:rPr>
-        <w:t>".</w:t>
+        <w:t xml:space="preserve"> появились понятные aria-label, а у текущих ссылок в меню и в блоках авторизации был добавлен aria-current="page".</w:t>
       </w:r>
     </w:p>
     <w:p>
@@ -1187,79 +971,7 @@
           <w:sz w:val="28"/>
           <w:szCs w:val="28"/>
         </w:rPr>
-        <w:t xml:space="preserve">) На главной странице </w:t>
-      </w:r>
-      <w:proofErr w:type="spellStart"/>
-      <w:r>
-        <w:rPr>
-          <w:rFonts w:ascii="Times New Roman" w:eastAsia="Times New Roman" w:hAnsi="Times New Roman" w:cs="Times New Roman"/>
-          <w:sz w:val="28"/>
-          <w:szCs w:val="28"/>
-        </w:rPr>
-        <w:t>index</w:t>
-      </w:r>
-      <w:proofErr w:type="spellEnd"/>
-      <w:r>
-        <w:rPr>
-          <w:rFonts w:ascii="Times New Roman" w:eastAsia="Times New Roman" w:hAnsi="Times New Roman" w:cs="Times New Roman"/>
-          <w:sz w:val="28"/>
-          <w:szCs w:val="28"/>
-        </w:rPr>
-        <w:t xml:space="preserve"> пометил декоративные иконки как </w:t>
-      </w:r>
-      <w:proofErr w:type="spellStart"/>
-      <w:r>
-        <w:rPr>
-          <w:rFonts w:ascii="Times New Roman" w:eastAsia="Times New Roman" w:hAnsi="Times New Roman" w:cs="Times New Roman"/>
-          <w:sz w:val="28"/>
-          <w:szCs w:val="28"/>
-        </w:rPr>
-        <w:t>aria-hidden</w:t>
-      </w:r>
-      <w:proofErr w:type="spellEnd"/>
-      <w:r>
-        <w:rPr>
-          <w:rFonts w:ascii="Times New Roman" w:eastAsia="Times New Roman" w:hAnsi="Times New Roman" w:cs="Times New Roman"/>
-          <w:sz w:val="28"/>
-          <w:szCs w:val="28"/>
-        </w:rPr>
-        <w:t>="</w:t>
-      </w:r>
-      <w:proofErr w:type="spellStart"/>
-      <w:r>
-        <w:rPr>
-          <w:rFonts w:ascii="Times New Roman" w:eastAsia="Times New Roman" w:hAnsi="Times New Roman" w:cs="Times New Roman"/>
-          <w:sz w:val="28"/>
-          <w:szCs w:val="28"/>
-        </w:rPr>
-        <w:t>true</w:t>
-      </w:r>
-      <w:proofErr w:type="spellEnd"/>
-      <w:r>
-        <w:rPr>
-          <w:rFonts w:ascii="Times New Roman" w:eastAsia="Times New Roman" w:hAnsi="Times New Roman" w:cs="Times New Roman"/>
-          <w:sz w:val="28"/>
-          <w:szCs w:val="28"/>
-        </w:rPr>
-        <w:t xml:space="preserve">", связал крупные секции с их заголовками через </w:t>
-      </w:r>
-      <w:proofErr w:type="spellStart"/>
-      <w:r>
-        <w:rPr>
-          <w:rFonts w:ascii="Times New Roman" w:eastAsia="Times New Roman" w:hAnsi="Times New Roman" w:cs="Times New Roman"/>
-          <w:sz w:val="28"/>
-          <w:szCs w:val="28"/>
-        </w:rPr>
-        <w:t>aria-labelledby</w:t>
-      </w:r>
-      <w:proofErr w:type="spellEnd"/>
-      <w:r>
-        <w:rPr>
-          <w:rFonts w:ascii="Times New Roman" w:eastAsia="Times New Roman" w:hAnsi="Times New Roman" w:cs="Times New Roman"/>
-          <w:sz w:val="28"/>
-          <w:szCs w:val="28"/>
-        </w:rPr>
-        <w:t xml:space="preserve"> и сделал </w:t>
+        <w:t xml:space="preserve">) На главной странице index пометил декоративные иконки как aria-hidden="true", связал крупные секции с их заголовками через aria-labelledby и сделал </w:t>
       </w:r>
       <w:r>
         <w:rPr>
@@ -1275,25 +987,7 @@
           <w:sz w:val="28"/>
           <w:szCs w:val="28"/>
         </w:rPr>
-        <w:t xml:space="preserve"> отдельной навигационной областью. Это улучшило восприятие страницы для </w:t>
-      </w:r>
-      <w:proofErr w:type="spellStart"/>
-      <w:r>
-        <w:rPr>
-          <w:rFonts w:ascii="Times New Roman" w:eastAsia="Times New Roman" w:hAnsi="Times New Roman" w:cs="Times New Roman"/>
-          <w:sz w:val="28"/>
-          <w:szCs w:val="28"/>
-        </w:rPr>
-        <w:t>скринридеров</w:t>
-      </w:r>
-      <w:proofErr w:type="spellEnd"/>
-      <w:r>
-        <w:rPr>
-          <w:rFonts w:ascii="Times New Roman" w:eastAsia="Times New Roman" w:hAnsi="Times New Roman" w:cs="Times New Roman"/>
-          <w:sz w:val="28"/>
-          <w:szCs w:val="28"/>
-        </w:rPr>
-        <w:t xml:space="preserve"> без изменения визуальной структуры.</w:t>
+        <w:t xml:space="preserve"> отдельной навигационной областью. Это улучшило восприятие страницы для скринридеров без изменения визуальной структуры.</w:t>
       </w:r>
     </w:p>
     <w:p>
@@ -1320,205 +1014,7 @@
           <w:sz w:val="28"/>
           <w:szCs w:val="28"/>
         </w:rPr>
-        <w:t xml:space="preserve">) На странице </w:t>
-      </w:r>
-      <w:proofErr w:type="spellStart"/>
-      <w:r>
-        <w:rPr>
-          <w:rFonts w:ascii="Times New Roman" w:eastAsia="Times New Roman" w:hAnsi="Times New Roman" w:cs="Times New Roman"/>
-          <w:sz w:val="28"/>
-          <w:szCs w:val="28"/>
-        </w:rPr>
-        <w:t>login</w:t>
-      </w:r>
-      <w:proofErr w:type="spellEnd"/>
-      <w:r>
-        <w:rPr>
-          <w:rFonts w:ascii="Times New Roman" w:eastAsia="Times New Roman" w:hAnsi="Times New Roman" w:cs="Times New Roman"/>
-          <w:sz w:val="28"/>
-          <w:szCs w:val="28"/>
-        </w:rPr>
-        <w:t xml:space="preserve"> доработал форму входа: добавил </w:t>
-      </w:r>
-      <w:proofErr w:type="spellStart"/>
-      <w:r>
-        <w:rPr>
-          <w:rFonts w:ascii="Times New Roman" w:eastAsia="Times New Roman" w:hAnsi="Times New Roman" w:cs="Times New Roman"/>
-          <w:sz w:val="28"/>
-          <w:szCs w:val="28"/>
-        </w:rPr>
-        <w:t>autocomplete</w:t>
-      </w:r>
-      <w:proofErr w:type="spellEnd"/>
-      <w:r>
-        <w:rPr>
-          <w:rFonts w:ascii="Times New Roman" w:eastAsia="Times New Roman" w:hAnsi="Times New Roman" w:cs="Times New Roman"/>
-          <w:sz w:val="28"/>
-          <w:szCs w:val="28"/>
-        </w:rPr>
-        <w:t xml:space="preserve"> и </w:t>
-      </w:r>
-      <w:proofErr w:type="spellStart"/>
-      <w:r>
-        <w:rPr>
-          <w:rFonts w:ascii="Times New Roman" w:eastAsia="Times New Roman" w:hAnsi="Times New Roman" w:cs="Times New Roman"/>
-          <w:sz w:val="28"/>
-          <w:szCs w:val="28"/>
-        </w:rPr>
-        <w:t>inputmode</w:t>
-      </w:r>
-      <w:proofErr w:type="spellEnd"/>
-      <w:r>
-        <w:rPr>
-          <w:rFonts w:ascii="Times New Roman" w:eastAsia="Times New Roman" w:hAnsi="Times New Roman" w:cs="Times New Roman"/>
-          <w:sz w:val="28"/>
-          <w:szCs w:val="28"/>
-        </w:rPr>
-        <w:t xml:space="preserve"> для </w:t>
-      </w:r>
-      <w:proofErr w:type="spellStart"/>
-      <w:r>
-        <w:rPr>
-          <w:rFonts w:ascii="Times New Roman" w:eastAsia="Times New Roman" w:hAnsi="Times New Roman" w:cs="Times New Roman"/>
-          <w:sz w:val="28"/>
-          <w:szCs w:val="28"/>
-        </w:rPr>
-        <w:t>email</w:t>
-      </w:r>
-      <w:proofErr w:type="spellEnd"/>
-      <w:r>
-        <w:rPr>
-          <w:rFonts w:ascii="Times New Roman" w:eastAsia="Times New Roman" w:hAnsi="Times New Roman" w:cs="Times New Roman"/>
-          <w:sz w:val="28"/>
-          <w:szCs w:val="28"/>
-        </w:rPr>
-        <w:t xml:space="preserve">, </w:t>
-      </w:r>
-      <w:proofErr w:type="spellStart"/>
-      <w:r>
-        <w:rPr>
-          <w:rFonts w:ascii="Times New Roman" w:eastAsia="Times New Roman" w:hAnsi="Times New Roman" w:cs="Times New Roman"/>
-          <w:sz w:val="28"/>
-          <w:szCs w:val="28"/>
-        </w:rPr>
-        <w:t>autocomplete</w:t>
-      </w:r>
-      <w:proofErr w:type="spellEnd"/>
-      <w:r>
-        <w:rPr>
-          <w:rFonts w:ascii="Times New Roman" w:eastAsia="Times New Roman" w:hAnsi="Times New Roman" w:cs="Times New Roman"/>
-          <w:sz w:val="28"/>
-          <w:szCs w:val="28"/>
-        </w:rPr>
-        <w:t xml:space="preserve"> для текущего пароля, </w:t>
-      </w:r>
-      <w:proofErr w:type="spellStart"/>
-      <w:r>
-        <w:rPr>
-          <w:rFonts w:ascii="Times New Roman" w:eastAsia="Times New Roman" w:hAnsi="Times New Roman" w:cs="Times New Roman"/>
-          <w:sz w:val="28"/>
-          <w:szCs w:val="28"/>
-        </w:rPr>
-        <w:t>aria-label</w:t>
-      </w:r>
-      <w:proofErr w:type="spellEnd"/>
-      <w:r>
-        <w:rPr>
-          <w:rFonts w:ascii="Times New Roman" w:eastAsia="Times New Roman" w:hAnsi="Times New Roman" w:cs="Times New Roman"/>
-          <w:sz w:val="28"/>
-          <w:szCs w:val="28"/>
-        </w:rPr>
-        <w:t xml:space="preserve"> и </w:t>
-      </w:r>
-      <w:proofErr w:type="spellStart"/>
-      <w:r>
-        <w:rPr>
-          <w:rFonts w:ascii="Times New Roman" w:eastAsia="Times New Roman" w:hAnsi="Times New Roman" w:cs="Times New Roman"/>
-          <w:sz w:val="28"/>
-          <w:szCs w:val="28"/>
-        </w:rPr>
-        <w:t>aria-pressed</w:t>
-      </w:r>
-      <w:proofErr w:type="spellEnd"/>
-      <w:r>
-        <w:rPr>
-          <w:rFonts w:ascii="Times New Roman" w:eastAsia="Times New Roman" w:hAnsi="Times New Roman" w:cs="Times New Roman"/>
-          <w:sz w:val="28"/>
-          <w:szCs w:val="28"/>
-        </w:rPr>
-        <w:t xml:space="preserve"> для кнопки показа пароля, а также </w:t>
-      </w:r>
-      <w:proofErr w:type="spellStart"/>
-      <w:r>
-        <w:rPr>
-          <w:rFonts w:ascii="Times New Roman" w:eastAsia="Times New Roman" w:hAnsi="Times New Roman" w:cs="Times New Roman"/>
-          <w:sz w:val="28"/>
-          <w:szCs w:val="28"/>
-        </w:rPr>
-        <w:t>role</w:t>
-      </w:r>
-      <w:proofErr w:type="spellEnd"/>
-      <w:r>
-        <w:rPr>
-          <w:rFonts w:ascii="Times New Roman" w:eastAsia="Times New Roman" w:hAnsi="Times New Roman" w:cs="Times New Roman"/>
-          <w:sz w:val="28"/>
-          <w:szCs w:val="28"/>
-        </w:rPr>
-        <w:t>="</w:t>
-      </w:r>
-      <w:proofErr w:type="spellStart"/>
-      <w:r>
-        <w:rPr>
-          <w:rFonts w:ascii="Times New Roman" w:eastAsia="Times New Roman" w:hAnsi="Times New Roman" w:cs="Times New Roman"/>
-          <w:sz w:val="28"/>
-          <w:szCs w:val="28"/>
-        </w:rPr>
-        <w:t>alert</w:t>
-      </w:r>
-      <w:proofErr w:type="spellEnd"/>
-      <w:r>
-        <w:rPr>
-          <w:rFonts w:ascii="Times New Roman" w:eastAsia="Times New Roman" w:hAnsi="Times New Roman" w:cs="Times New Roman"/>
-          <w:sz w:val="28"/>
-          <w:szCs w:val="28"/>
-        </w:rPr>
-        <w:t xml:space="preserve">" и </w:t>
-      </w:r>
-      <w:proofErr w:type="spellStart"/>
-      <w:r>
-        <w:rPr>
-          <w:rFonts w:ascii="Times New Roman" w:eastAsia="Times New Roman" w:hAnsi="Times New Roman" w:cs="Times New Roman"/>
-          <w:sz w:val="28"/>
-          <w:szCs w:val="28"/>
-        </w:rPr>
-        <w:t>aria-live</w:t>
-      </w:r>
-      <w:proofErr w:type="spellEnd"/>
-      <w:r>
-        <w:rPr>
-          <w:rFonts w:ascii="Times New Roman" w:eastAsia="Times New Roman" w:hAnsi="Times New Roman" w:cs="Times New Roman"/>
-          <w:sz w:val="28"/>
-          <w:szCs w:val="28"/>
-        </w:rPr>
-        <w:t xml:space="preserve"> для блока вывода ошибок. У модального окна восстановления доступа добавил </w:t>
-      </w:r>
-      <w:proofErr w:type="spellStart"/>
-      <w:r>
-        <w:rPr>
-          <w:rFonts w:ascii="Times New Roman" w:eastAsia="Times New Roman" w:hAnsi="Times New Roman" w:cs="Times New Roman"/>
-          <w:sz w:val="28"/>
-          <w:szCs w:val="28"/>
-        </w:rPr>
-        <w:t>aria-describedby</w:t>
-      </w:r>
-      <w:proofErr w:type="spellEnd"/>
-      <w:r>
-        <w:rPr>
-          <w:rFonts w:ascii="Times New Roman" w:eastAsia="Times New Roman" w:hAnsi="Times New Roman" w:cs="Times New Roman"/>
-          <w:sz w:val="28"/>
-          <w:szCs w:val="28"/>
-        </w:rPr>
-        <w:t>, чтобы описание правильно читалось целиком</w:t>
+        <w:t>) На странице login доработал форму входа: добавил autocomplete и inputmode для email, autocomplete для текущего пароля, aria-label и aria-pressed для кнопки показа пароля, а также role="alert" и aria-live для блока вывода ошибок. У модального окна восстановления доступа добавил aria-describedby, чтобы описание правильно читалось целиком</w:t>
       </w:r>
     </w:p>
     <w:p>
@@ -1537,149 +1033,7 @@
           <w:sz w:val="28"/>
           <w:szCs w:val="28"/>
         </w:rPr>
-        <w:t>5</w:t>
-      </w:r>
-      <w:r>
-        <w:rPr>
-          <w:rFonts w:ascii="Times New Roman" w:eastAsia="Times New Roman" w:hAnsi="Times New Roman" w:cs="Times New Roman"/>
-          <w:sz w:val="28"/>
-          <w:szCs w:val="28"/>
-        </w:rPr>
-        <w:t xml:space="preserve">) На странице </w:t>
-      </w:r>
-      <w:proofErr w:type="spellStart"/>
-      <w:r>
-        <w:rPr>
-          <w:rFonts w:ascii="Times New Roman" w:eastAsia="Times New Roman" w:hAnsi="Times New Roman" w:cs="Times New Roman"/>
-          <w:sz w:val="28"/>
-          <w:szCs w:val="28"/>
-        </w:rPr>
-        <w:t>register</w:t>
-      </w:r>
-      <w:proofErr w:type="spellEnd"/>
-      <w:r>
-        <w:rPr>
-          <w:rFonts w:ascii="Times New Roman" w:eastAsia="Times New Roman" w:hAnsi="Times New Roman" w:cs="Times New Roman"/>
-          <w:sz w:val="28"/>
-          <w:szCs w:val="28"/>
-        </w:rPr>
-        <w:t xml:space="preserve"> сделал похожую доработку формы регистрации. Поля имени, фамилии, </w:t>
-      </w:r>
-      <w:proofErr w:type="spellStart"/>
-      <w:r>
-        <w:rPr>
-          <w:rFonts w:ascii="Times New Roman" w:eastAsia="Times New Roman" w:hAnsi="Times New Roman" w:cs="Times New Roman"/>
-          <w:sz w:val="28"/>
-          <w:szCs w:val="28"/>
-        </w:rPr>
-        <w:t>email</w:t>
-      </w:r>
-      <w:proofErr w:type="spellEnd"/>
-      <w:r>
-        <w:rPr>
-          <w:rFonts w:ascii="Times New Roman" w:eastAsia="Times New Roman" w:hAnsi="Times New Roman" w:cs="Times New Roman"/>
-          <w:sz w:val="28"/>
-          <w:szCs w:val="28"/>
-        </w:rPr>
-        <w:t xml:space="preserve"> и пароля получили </w:t>
-      </w:r>
-      <w:proofErr w:type="spellStart"/>
-      <w:r>
-        <w:rPr>
-          <w:rFonts w:ascii="Times New Roman" w:eastAsia="Times New Roman" w:hAnsi="Times New Roman" w:cs="Times New Roman"/>
-          <w:sz w:val="28"/>
-          <w:szCs w:val="28"/>
-        </w:rPr>
-        <w:t>autocomplete</w:t>
-      </w:r>
-      <w:proofErr w:type="spellEnd"/>
-      <w:r>
-        <w:rPr>
-          <w:rFonts w:ascii="Times New Roman" w:eastAsia="Times New Roman" w:hAnsi="Times New Roman" w:cs="Times New Roman"/>
-          <w:sz w:val="28"/>
-          <w:szCs w:val="28"/>
-        </w:rPr>
-        <w:t xml:space="preserve"> </w:t>
-      </w:r>
-      <w:r>
-        <w:rPr>
-          <w:rFonts w:ascii="Times New Roman" w:eastAsia="Times New Roman" w:hAnsi="Times New Roman" w:cs="Times New Roman"/>
-          <w:sz w:val="28"/>
-          <w:szCs w:val="28"/>
-        </w:rPr>
-        <w:t xml:space="preserve">атрибуты, для блока выбора тарифа использовал </w:t>
-      </w:r>
-      <w:proofErr w:type="spellStart"/>
-      <w:r>
-        <w:rPr>
-          <w:rFonts w:ascii="Times New Roman" w:eastAsia="Times New Roman" w:hAnsi="Times New Roman" w:cs="Times New Roman"/>
-          <w:sz w:val="28"/>
-          <w:szCs w:val="28"/>
-        </w:rPr>
-        <w:t>fieldset</w:t>
-      </w:r>
-      <w:proofErr w:type="spellEnd"/>
-      <w:r>
-        <w:rPr>
-          <w:rFonts w:ascii="Times New Roman" w:eastAsia="Times New Roman" w:hAnsi="Times New Roman" w:cs="Times New Roman"/>
-          <w:sz w:val="28"/>
-          <w:szCs w:val="28"/>
-        </w:rPr>
-        <w:t xml:space="preserve"> и </w:t>
-      </w:r>
-      <w:proofErr w:type="spellStart"/>
-      <w:r>
-        <w:rPr>
-          <w:rFonts w:ascii="Times New Roman" w:eastAsia="Times New Roman" w:hAnsi="Times New Roman" w:cs="Times New Roman"/>
-          <w:sz w:val="28"/>
-          <w:szCs w:val="28"/>
-        </w:rPr>
-        <w:t>legend</w:t>
-      </w:r>
-      <w:proofErr w:type="spellEnd"/>
-      <w:r>
-        <w:rPr>
-          <w:rFonts w:ascii="Times New Roman" w:eastAsia="Times New Roman" w:hAnsi="Times New Roman" w:cs="Times New Roman"/>
-          <w:sz w:val="28"/>
-          <w:szCs w:val="28"/>
-        </w:rPr>
-        <w:t xml:space="preserve">. Отдельно добавил </w:t>
-      </w:r>
-      <w:proofErr w:type="spellStart"/>
-      <w:r>
-        <w:rPr>
-          <w:rFonts w:ascii="Times New Roman" w:eastAsia="Times New Roman" w:hAnsi="Times New Roman" w:cs="Times New Roman"/>
-          <w:sz w:val="28"/>
-          <w:szCs w:val="28"/>
-        </w:rPr>
-        <w:t>aria-describedby</w:t>
-      </w:r>
-      <w:proofErr w:type="spellEnd"/>
-      <w:r>
-        <w:rPr>
-          <w:rFonts w:ascii="Times New Roman" w:eastAsia="Times New Roman" w:hAnsi="Times New Roman" w:cs="Times New Roman"/>
-          <w:sz w:val="28"/>
-          <w:szCs w:val="28"/>
-        </w:rPr>
-        <w:t xml:space="preserve"> к полю пароля и </w:t>
-      </w:r>
-      <w:proofErr w:type="spellStart"/>
-      <w:r>
-        <w:rPr>
-          <w:rFonts w:ascii="Times New Roman" w:eastAsia="Times New Roman" w:hAnsi="Times New Roman" w:cs="Times New Roman"/>
-          <w:sz w:val="28"/>
-          <w:szCs w:val="28"/>
-        </w:rPr>
-        <w:t>live-region</w:t>
-      </w:r>
-      <w:proofErr w:type="spellEnd"/>
-      <w:r>
-        <w:rPr>
-          <w:rFonts w:ascii="Times New Roman" w:eastAsia="Times New Roman" w:hAnsi="Times New Roman" w:cs="Times New Roman"/>
-          <w:sz w:val="28"/>
-          <w:szCs w:val="28"/>
-        </w:rPr>
-        <w:t xml:space="preserve"> для текста о силе пароля.</w:t>
+        <w:t>5) На странице register сделал похожую доработку формы регистрации. Поля имени, фамилии, email и пароля получили autocomplete атрибуты, для блока выбора тарифа использовал fieldset и legend. Отдельно добавил aria-describedby к полю пароля и live-region для текста о силе пароля.</w:t>
       </w:r>
     </w:p>
     <w:p>
@@ -1698,71 +1052,8 @@
           <w:sz w:val="28"/>
           <w:szCs w:val="28"/>
         </w:rPr>
-        <w:t>6</w:t>
-      </w:r>
-      <w:r>
-        <w:rPr>
-          <w:rFonts w:ascii="Times New Roman" w:eastAsia="Times New Roman" w:hAnsi="Times New Roman" w:cs="Times New Roman"/>
-          <w:sz w:val="28"/>
-          <w:szCs w:val="28"/>
-        </w:rPr>
-        <w:t xml:space="preserve">) На странице </w:t>
-      </w:r>
-      <w:proofErr w:type="spellStart"/>
-      <w:r>
-        <w:rPr>
-          <w:rFonts w:ascii="Times New Roman" w:eastAsia="Times New Roman" w:hAnsi="Times New Roman" w:cs="Times New Roman"/>
-          <w:sz w:val="28"/>
-          <w:szCs w:val="28"/>
-        </w:rPr>
-        <w:t>dashboard</w:t>
-      </w:r>
-      <w:proofErr w:type="spellEnd"/>
-      <w:r>
-        <w:rPr>
-          <w:rFonts w:ascii="Times New Roman" w:eastAsia="Times New Roman" w:hAnsi="Times New Roman" w:cs="Times New Roman"/>
-          <w:sz w:val="28"/>
-          <w:szCs w:val="28"/>
-        </w:rPr>
-        <w:t xml:space="preserve"> доработал динамические списки и фильтры. Списки счетов, бюджетов и транзакций получили </w:t>
-      </w:r>
-      <w:proofErr w:type="spellStart"/>
-      <w:r>
-        <w:rPr>
-          <w:rFonts w:ascii="Times New Roman" w:eastAsia="Times New Roman" w:hAnsi="Times New Roman" w:cs="Times New Roman"/>
-          <w:sz w:val="28"/>
-          <w:szCs w:val="28"/>
-        </w:rPr>
-        <w:t>role</w:t>
-      </w:r>
-      <w:proofErr w:type="spellEnd"/>
-      <w:r>
-        <w:rPr>
-          <w:rFonts w:ascii="Times New Roman" w:eastAsia="Times New Roman" w:hAnsi="Times New Roman" w:cs="Times New Roman"/>
-          <w:sz w:val="28"/>
-          <w:szCs w:val="28"/>
-        </w:rPr>
-        <w:t>="</w:t>
-      </w:r>
-      <w:proofErr w:type="spellStart"/>
-      <w:r>
-        <w:rPr>
-          <w:rFonts w:ascii="Times New Roman" w:eastAsia="Times New Roman" w:hAnsi="Times New Roman" w:cs="Times New Roman"/>
-          <w:sz w:val="28"/>
-          <w:szCs w:val="28"/>
-        </w:rPr>
-        <w:t>list</w:t>
-      </w:r>
-      <w:proofErr w:type="spellEnd"/>
-      <w:r>
-        <w:rPr>
-          <w:rFonts w:ascii="Times New Roman" w:eastAsia="Times New Roman" w:hAnsi="Times New Roman" w:cs="Times New Roman"/>
-          <w:sz w:val="28"/>
-          <w:szCs w:val="28"/>
-        </w:rPr>
-        <w:t xml:space="preserve">" и </w:t>
-      </w:r>
-      <w:proofErr w:type="spellStart"/>
+        <w:t xml:space="preserve">6) На странице dashboard доработал динамические списки и фильтры. Списки счетов, бюджетов и транзакций получили role="list" и </w:t>
+      </w:r>
       <w:r>
         <w:rPr>
           <w:rFonts w:ascii="Times New Roman" w:eastAsia="Times New Roman" w:hAnsi="Times New Roman" w:cs="Times New Roman"/>
@@ -1770,160 +1061,7 @@
           <w:szCs w:val="28"/>
         </w:rPr>
         <w:lastRenderedPageBreak/>
-        <w:t>role</w:t>
-      </w:r>
-      <w:proofErr w:type="spellEnd"/>
-      <w:r>
-        <w:rPr>
-          <w:rFonts w:ascii="Times New Roman" w:eastAsia="Times New Roman" w:hAnsi="Times New Roman" w:cs="Times New Roman"/>
-          <w:sz w:val="28"/>
-          <w:szCs w:val="28"/>
-        </w:rPr>
-        <w:t>="</w:t>
-      </w:r>
-      <w:proofErr w:type="spellStart"/>
-      <w:r>
-        <w:rPr>
-          <w:rFonts w:ascii="Times New Roman" w:eastAsia="Times New Roman" w:hAnsi="Times New Roman" w:cs="Times New Roman"/>
-          <w:sz w:val="28"/>
-          <w:szCs w:val="28"/>
-        </w:rPr>
-        <w:t>listitem</w:t>
-      </w:r>
-      <w:proofErr w:type="spellEnd"/>
-      <w:r>
-        <w:rPr>
-          <w:rFonts w:ascii="Times New Roman" w:eastAsia="Times New Roman" w:hAnsi="Times New Roman" w:cs="Times New Roman"/>
-          <w:sz w:val="28"/>
-          <w:szCs w:val="28"/>
-        </w:rPr>
-        <w:t xml:space="preserve">", у </w:t>
-      </w:r>
-      <w:proofErr w:type="spellStart"/>
-      <w:r>
-        <w:rPr>
-          <w:rFonts w:ascii="Times New Roman" w:eastAsia="Times New Roman" w:hAnsi="Times New Roman" w:cs="Times New Roman"/>
-          <w:sz w:val="28"/>
-          <w:szCs w:val="28"/>
-        </w:rPr>
-        <w:t>progress-bar</w:t>
-      </w:r>
-      <w:proofErr w:type="spellEnd"/>
-      <w:r>
-        <w:rPr>
-          <w:rFonts w:ascii="Times New Roman" w:eastAsia="Times New Roman" w:hAnsi="Times New Roman" w:cs="Times New Roman"/>
-          <w:sz w:val="28"/>
-          <w:szCs w:val="28"/>
-        </w:rPr>
-        <w:t xml:space="preserve"> появились </w:t>
-      </w:r>
-      <w:proofErr w:type="spellStart"/>
-      <w:r>
-        <w:rPr>
-          <w:rFonts w:ascii="Times New Roman" w:eastAsia="Times New Roman" w:hAnsi="Times New Roman" w:cs="Times New Roman"/>
-          <w:sz w:val="28"/>
-          <w:szCs w:val="28"/>
-        </w:rPr>
-        <w:t>aria-valuemin</w:t>
-      </w:r>
-      <w:proofErr w:type="spellEnd"/>
-      <w:r>
-        <w:rPr>
-          <w:rFonts w:ascii="Times New Roman" w:eastAsia="Times New Roman" w:hAnsi="Times New Roman" w:cs="Times New Roman"/>
-          <w:sz w:val="28"/>
-          <w:szCs w:val="28"/>
-        </w:rPr>
-        <w:t xml:space="preserve">, </w:t>
-      </w:r>
-      <w:proofErr w:type="spellStart"/>
-      <w:r>
-        <w:rPr>
-          <w:rFonts w:ascii="Times New Roman" w:eastAsia="Times New Roman" w:hAnsi="Times New Roman" w:cs="Times New Roman"/>
-          <w:sz w:val="28"/>
-          <w:szCs w:val="28"/>
-        </w:rPr>
-        <w:t>aria-valuemax</w:t>
-      </w:r>
-      <w:proofErr w:type="spellEnd"/>
-      <w:r>
-        <w:rPr>
-          <w:rFonts w:ascii="Times New Roman" w:eastAsia="Times New Roman" w:hAnsi="Times New Roman" w:cs="Times New Roman"/>
-          <w:sz w:val="28"/>
-          <w:szCs w:val="28"/>
-        </w:rPr>
-        <w:t xml:space="preserve"> и </w:t>
-      </w:r>
-      <w:proofErr w:type="spellStart"/>
-      <w:r>
-        <w:rPr>
-          <w:rFonts w:ascii="Times New Roman" w:eastAsia="Times New Roman" w:hAnsi="Times New Roman" w:cs="Times New Roman"/>
-          <w:sz w:val="28"/>
-          <w:szCs w:val="28"/>
-        </w:rPr>
-        <w:t>aria-valuenow</w:t>
-      </w:r>
-      <w:proofErr w:type="spellEnd"/>
-      <w:r>
-        <w:rPr>
-          <w:rFonts w:ascii="Times New Roman" w:eastAsia="Times New Roman" w:hAnsi="Times New Roman" w:cs="Times New Roman"/>
-          <w:sz w:val="28"/>
-          <w:szCs w:val="28"/>
-        </w:rPr>
-        <w:t xml:space="preserve">, счетчик найденных транзакций стал </w:t>
-      </w:r>
-      <w:proofErr w:type="spellStart"/>
-      <w:r>
-        <w:rPr>
-          <w:rFonts w:ascii="Times New Roman" w:eastAsia="Times New Roman" w:hAnsi="Times New Roman" w:cs="Times New Roman"/>
-          <w:sz w:val="28"/>
-          <w:szCs w:val="28"/>
-        </w:rPr>
-        <w:t>status</w:t>
-      </w:r>
-      <w:proofErr w:type="spellEnd"/>
-      <w:r>
-        <w:rPr>
-          <w:rFonts w:ascii="Times New Roman" w:eastAsia="Times New Roman" w:hAnsi="Times New Roman" w:cs="Times New Roman"/>
-          <w:sz w:val="28"/>
-          <w:szCs w:val="28"/>
-        </w:rPr>
-        <w:t>/</w:t>
-      </w:r>
-      <w:proofErr w:type="spellStart"/>
-      <w:r>
-        <w:rPr>
-          <w:rFonts w:ascii="Times New Roman" w:eastAsia="Times New Roman" w:hAnsi="Times New Roman" w:cs="Times New Roman"/>
-          <w:sz w:val="28"/>
-          <w:szCs w:val="28"/>
-        </w:rPr>
-        <w:t>live-region</w:t>
-      </w:r>
-      <w:proofErr w:type="spellEnd"/>
-      <w:r>
-        <w:rPr>
-          <w:rFonts w:ascii="Times New Roman" w:eastAsia="Times New Roman" w:hAnsi="Times New Roman" w:cs="Times New Roman"/>
-          <w:sz w:val="28"/>
-          <w:szCs w:val="28"/>
-        </w:rPr>
-        <w:t xml:space="preserve">, а пустое состояние поиска теперь тоже объявляется корректно. Декоративные иконки в карточках и транзакциях были скрыты через </w:t>
-      </w:r>
-      <w:proofErr w:type="spellStart"/>
-      <w:r>
-        <w:rPr>
-          <w:rFonts w:ascii="Times New Roman" w:eastAsia="Times New Roman" w:hAnsi="Times New Roman" w:cs="Times New Roman"/>
-          <w:sz w:val="28"/>
-          <w:szCs w:val="28"/>
-        </w:rPr>
-        <w:t>aria-hidden</w:t>
-      </w:r>
-      <w:proofErr w:type="spellEnd"/>
-      <w:r>
-        <w:rPr>
-          <w:rFonts w:ascii="Times New Roman" w:eastAsia="Times New Roman" w:hAnsi="Times New Roman" w:cs="Times New Roman"/>
-          <w:sz w:val="28"/>
-          <w:szCs w:val="28"/>
-        </w:rPr>
-        <w:t>.</w:t>
+        <w:t>role="listitem", у progress-bar появились aria-valuemin, aria-valuemax и aria-valuenow, счетчик найденных транзакций стал status/live-region, а пустое состояние поиска теперь тоже объявляется корректно. Декоративные иконки в карточках и транзакциях были скрыты через aria-hidden.</w:t>
       </w:r>
     </w:p>
     <w:p>
@@ -1942,141 +1080,7 @@
           <w:sz w:val="28"/>
           <w:szCs w:val="28"/>
         </w:rPr>
-        <w:t>7</w:t>
-      </w:r>
-      <w:r>
-        <w:rPr>
-          <w:rFonts w:ascii="Times New Roman" w:eastAsia="Times New Roman" w:hAnsi="Times New Roman" w:cs="Times New Roman"/>
-          <w:sz w:val="28"/>
-          <w:szCs w:val="28"/>
-        </w:rPr>
-        <w:t xml:space="preserve">) На странице </w:t>
-      </w:r>
-      <w:proofErr w:type="spellStart"/>
-      <w:r>
-        <w:rPr>
-          <w:rFonts w:ascii="Times New Roman" w:eastAsia="Times New Roman" w:hAnsi="Times New Roman" w:cs="Times New Roman"/>
-          <w:sz w:val="28"/>
-          <w:szCs w:val="28"/>
-        </w:rPr>
-        <w:t>reports</w:t>
-      </w:r>
-      <w:proofErr w:type="spellEnd"/>
-      <w:r>
-        <w:rPr>
-          <w:rFonts w:ascii="Times New Roman" w:eastAsia="Times New Roman" w:hAnsi="Times New Roman" w:cs="Times New Roman"/>
-          <w:sz w:val="28"/>
-          <w:szCs w:val="28"/>
-        </w:rPr>
-        <w:t xml:space="preserve"> улучшил доступность переключателя периода и графиков. Для группы кнопок периода добавил </w:t>
-      </w:r>
-      <w:proofErr w:type="spellStart"/>
-      <w:r>
-        <w:rPr>
-          <w:rFonts w:ascii="Times New Roman" w:eastAsia="Times New Roman" w:hAnsi="Times New Roman" w:cs="Times New Roman"/>
-          <w:sz w:val="28"/>
-          <w:szCs w:val="28"/>
-        </w:rPr>
-        <w:t>role</w:t>
-      </w:r>
-      <w:proofErr w:type="spellEnd"/>
-      <w:r>
-        <w:rPr>
-          <w:rFonts w:ascii="Times New Roman" w:eastAsia="Times New Roman" w:hAnsi="Times New Roman" w:cs="Times New Roman"/>
-          <w:sz w:val="28"/>
-          <w:szCs w:val="28"/>
-        </w:rPr>
-        <w:t>="</w:t>
-      </w:r>
-      <w:proofErr w:type="spellStart"/>
-      <w:r>
-        <w:rPr>
-          <w:rFonts w:ascii="Times New Roman" w:eastAsia="Times New Roman" w:hAnsi="Times New Roman" w:cs="Times New Roman"/>
-          <w:sz w:val="28"/>
-          <w:szCs w:val="28"/>
-        </w:rPr>
-        <w:t>group</w:t>
-      </w:r>
-      <w:proofErr w:type="spellEnd"/>
-      <w:r>
-        <w:rPr>
-          <w:rFonts w:ascii="Times New Roman" w:eastAsia="Times New Roman" w:hAnsi="Times New Roman" w:cs="Times New Roman"/>
-          <w:sz w:val="28"/>
-          <w:szCs w:val="28"/>
-        </w:rPr>
-        <w:t xml:space="preserve">" и </w:t>
-      </w:r>
-      <w:proofErr w:type="spellStart"/>
-      <w:r>
-        <w:rPr>
-          <w:rFonts w:ascii="Times New Roman" w:eastAsia="Times New Roman" w:hAnsi="Times New Roman" w:cs="Times New Roman"/>
-          <w:sz w:val="28"/>
-          <w:szCs w:val="28"/>
-        </w:rPr>
-        <w:t>aria-pressed</w:t>
-      </w:r>
-      <w:proofErr w:type="spellEnd"/>
-      <w:r>
-        <w:rPr>
-          <w:rFonts w:ascii="Times New Roman" w:eastAsia="Times New Roman" w:hAnsi="Times New Roman" w:cs="Times New Roman"/>
-          <w:sz w:val="28"/>
-          <w:szCs w:val="28"/>
-        </w:rPr>
-        <w:t xml:space="preserve">, а у </w:t>
-      </w:r>
-      <w:proofErr w:type="spellStart"/>
-      <w:r>
-        <w:rPr>
-          <w:rFonts w:ascii="Times New Roman" w:eastAsia="Times New Roman" w:hAnsi="Times New Roman" w:cs="Times New Roman"/>
-          <w:sz w:val="28"/>
-          <w:szCs w:val="28"/>
-        </w:rPr>
-        <w:t>canvas</w:t>
-      </w:r>
-      <w:proofErr w:type="spellEnd"/>
-      <w:r>
-        <w:rPr>
-          <w:rFonts w:ascii="Times New Roman" w:eastAsia="Times New Roman" w:hAnsi="Times New Roman" w:cs="Times New Roman"/>
-          <w:sz w:val="28"/>
-          <w:szCs w:val="28"/>
-        </w:rPr>
-        <w:t xml:space="preserve"> с графиками появились текстовые альтернативы через </w:t>
-      </w:r>
-      <w:proofErr w:type="spellStart"/>
-      <w:r>
-        <w:rPr>
-          <w:rFonts w:ascii="Times New Roman" w:eastAsia="Times New Roman" w:hAnsi="Times New Roman" w:cs="Times New Roman"/>
-          <w:sz w:val="28"/>
-          <w:szCs w:val="28"/>
-        </w:rPr>
-        <w:t>aria-label</w:t>
-      </w:r>
-      <w:proofErr w:type="spellEnd"/>
-      <w:r>
-        <w:rPr>
-          <w:rFonts w:ascii="Times New Roman" w:eastAsia="Times New Roman" w:hAnsi="Times New Roman" w:cs="Times New Roman"/>
-          <w:sz w:val="28"/>
-          <w:szCs w:val="28"/>
-        </w:rPr>
-        <w:t xml:space="preserve"> и </w:t>
-      </w:r>
-      <w:proofErr w:type="spellStart"/>
-      <w:r>
-        <w:rPr>
-          <w:rFonts w:ascii="Times New Roman" w:eastAsia="Times New Roman" w:hAnsi="Times New Roman" w:cs="Times New Roman"/>
-          <w:sz w:val="28"/>
-          <w:szCs w:val="28"/>
-        </w:rPr>
-        <w:t>aria-describedby</w:t>
-      </w:r>
-      <w:proofErr w:type="spellEnd"/>
-      <w:r>
-        <w:rPr>
-          <w:rFonts w:ascii="Times New Roman" w:eastAsia="Times New Roman" w:hAnsi="Times New Roman" w:cs="Times New Roman"/>
-          <w:sz w:val="28"/>
-          <w:szCs w:val="28"/>
-        </w:rPr>
-        <w:t>. В JavaScript добавил обновление скрытых текстовых описаний графиков и списка категорий после смены периода.</w:t>
+        <w:t>7) На странице reports улучшил доступность переключателя периода и графиков. Для группы кнопок периода добавил role="group" и aria-pressed, а у canvas с графиками появились текстовые альтернативы через aria-label и aria-describedby. В JavaScript добавил обновление скрытых текстовых описаний графиков и списка категорий после смены периода.</w:t>
       </w:r>
     </w:p>
     <w:p>
@@ -2095,123 +1099,7 @@
           <w:sz w:val="28"/>
           <w:szCs w:val="28"/>
         </w:rPr>
-        <w:t>8</w:t>
-      </w:r>
-      <w:r>
-        <w:rPr>
-          <w:rFonts w:ascii="Times New Roman" w:eastAsia="Times New Roman" w:hAnsi="Times New Roman" w:cs="Times New Roman"/>
-          <w:sz w:val="28"/>
-          <w:szCs w:val="28"/>
-        </w:rPr>
-        <w:t xml:space="preserve">) На странице </w:t>
-      </w:r>
-      <w:proofErr w:type="spellStart"/>
-      <w:r>
-        <w:rPr>
-          <w:rFonts w:ascii="Times New Roman" w:eastAsia="Times New Roman" w:hAnsi="Times New Roman" w:cs="Times New Roman"/>
-          <w:sz w:val="28"/>
-          <w:szCs w:val="28"/>
-        </w:rPr>
-        <w:t>integrations</w:t>
-      </w:r>
-      <w:proofErr w:type="spellEnd"/>
-      <w:r>
-        <w:rPr>
-          <w:rFonts w:ascii="Times New Roman" w:eastAsia="Times New Roman" w:hAnsi="Times New Roman" w:cs="Times New Roman"/>
-          <w:sz w:val="28"/>
-          <w:szCs w:val="28"/>
-        </w:rPr>
-        <w:t xml:space="preserve"> сделал доступнее список подключений, форму создания правила и модальное окно импорта. У списка интеграций появились роли </w:t>
-      </w:r>
-      <w:proofErr w:type="spellStart"/>
-      <w:r>
-        <w:rPr>
-          <w:rFonts w:ascii="Times New Roman" w:eastAsia="Times New Roman" w:hAnsi="Times New Roman" w:cs="Times New Roman"/>
-          <w:sz w:val="28"/>
-          <w:szCs w:val="28"/>
-        </w:rPr>
-        <w:t>list</w:t>
-      </w:r>
-      <w:proofErr w:type="spellEnd"/>
-      <w:r>
-        <w:rPr>
-          <w:rFonts w:ascii="Times New Roman" w:eastAsia="Times New Roman" w:hAnsi="Times New Roman" w:cs="Times New Roman"/>
-          <w:sz w:val="28"/>
-          <w:szCs w:val="28"/>
-        </w:rPr>
-        <w:t>/</w:t>
-      </w:r>
-      <w:proofErr w:type="spellStart"/>
-      <w:r>
-        <w:rPr>
-          <w:rFonts w:ascii="Times New Roman" w:eastAsia="Times New Roman" w:hAnsi="Times New Roman" w:cs="Times New Roman"/>
-          <w:sz w:val="28"/>
-          <w:szCs w:val="28"/>
-        </w:rPr>
-        <w:t>listitem</w:t>
-      </w:r>
-      <w:proofErr w:type="spellEnd"/>
-      <w:r>
-        <w:rPr>
-          <w:rFonts w:ascii="Times New Roman" w:eastAsia="Times New Roman" w:hAnsi="Times New Roman" w:cs="Times New Roman"/>
-          <w:sz w:val="28"/>
-          <w:szCs w:val="28"/>
-        </w:rPr>
-        <w:t xml:space="preserve">, у сообщений формы и модального окна появились </w:t>
-      </w:r>
-      <w:proofErr w:type="spellStart"/>
-      <w:r>
-        <w:rPr>
-          <w:rFonts w:ascii="Times New Roman" w:eastAsia="Times New Roman" w:hAnsi="Times New Roman" w:cs="Times New Roman"/>
-          <w:sz w:val="28"/>
-          <w:szCs w:val="28"/>
-        </w:rPr>
-        <w:t>live-region</w:t>
-      </w:r>
-      <w:proofErr w:type="spellEnd"/>
-      <w:r>
-        <w:rPr>
-          <w:rFonts w:ascii="Times New Roman" w:eastAsia="Times New Roman" w:hAnsi="Times New Roman" w:cs="Times New Roman"/>
-          <w:sz w:val="28"/>
-          <w:szCs w:val="28"/>
-        </w:rPr>
-        <w:t xml:space="preserve">, а у загрузки CSV были добавлены </w:t>
-      </w:r>
-      <w:proofErr w:type="spellStart"/>
-      <w:r>
-        <w:rPr>
-          <w:rFonts w:ascii="Times New Roman" w:eastAsia="Times New Roman" w:hAnsi="Times New Roman" w:cs="Times New Roman"/>
-          <w:sz w:val="28"/>
-          <w:szCs w:val="28"/>
-        </w:rPr>
-        <w:t>accept</w:t>
-      </w:r>
-      <w:proofErr w:type="spellEnd"/>
-      <w:r>
-        <w:rPr>
-          <w:rFonts w:ascii="Times New Roman" w:eastAsia="Times New Roman" w:hAnsi="Times New Roman" w:cs="Times New Roman"/>
-          <w:sz w:val="28"/>
-          <w:szCs w:val="28"/>
-        </w:rPr>
-        <w:t xml:space="preserve"> и текстовая подсказка через </w:t>
-      </w:r>
-      <w:proofErr w:type="spellStart"/>
-      <w:r>
-        <w:rPr>
-          <w:rFonts w:ascii="Times New Roman" w:eastAsia="Times New Roman" w:hAnsi="Times New Roman" w:cs="Times New Roman"/>
-          <w:sz w:val="28"/>
-          <w:szCs w:val="28"/>
-        </w:rPr>
-        <w:t>aria-describedby</w:t>
-      </w:r>
-      <w:proofErr w:type="spellEnd"/>
-      <w:r>
-        <w:rPr>
-          <w:rFonts w:ascii="Times New Roman" w:eastAsia="Times New Roman" w:hAnsi="Times New Roman" w:cs="Times New Roman"/>
-          <w:sz w:val="28"/>
-          <w:szCs w:val="28"/>
-        </w:rPr>
-        <w:t>.</w:t>
+        <w:t>8) На странице integrations сделал доступнее список подключений, форму создания правила и модальное окно импорта. У списка интеграций появились роли list/listitem, у сообщений формы и модального окна появились live-region, а у загрузки CSV были добавлены accept и текстовая подсказка через aria-describedby.</w:t>
       </w:r>
     </w:p>
     <w:p>
@@ -2230,15 +1118,7 @@
           <w:sz w:val="28"/>
           <w:szCs w:val="28"/>
         </w:rPr>
-        <w:t>9</w:t>
-      </w:r>
-      <w:r>
-        <w:rPr>
-          <w:rFonts w:ascii="Times New Roman" w:eastAsia="Times New Roman" w:hAnsi="Times New Roman" w:cs="Times New Roman"/>
-          <w:sz w:val="28"/>
-          <w:szCs w:val="28"/>
-        </w:rPr>
-        <w:t xml:space="preserve">) Дополнительно изменил </w:t>
+        <w:t xml:space="preserve">9) Дополнительно изменил </w:t>
       </w:r>
       <w:r>
         <w:rPr>
@@ -2263,15 +1143,7 @@
           <w:sz w:val="28"/>
           <w:szCs w:val="28"/>
         </w:rPr>
-        <w:t xml:space="preserve">, чтобы </w:t>
-      </w:r>
-      <w:r>
-        <w:rPr>
-          <w:rFonts w:ascii="Times New Roman" w:eastAsia="Times New Roman" w:hAnsi="Times New Roman" w:cs="Times New Roman"/>
-          <w:sz w:val="28"/>
-          <w:szCs w:val="28"/>
-        </w:rPr>
-        <w:t>д</w:t>
+        <w:t>, чтобы д</w:t>
       </w:r>
       <w:r>
         <w:rPr>
@@ -2287,169 +1159,7 @@
           <w:sz w:val="28"/>
           <w:szCs w:val="28"/>
         </w:rPr>
-        <w:t xml:space="preserve"> не терялась после динамической перерисовки. Для кнопки показа пароля теперь обновляются </w:t>
-      </w:r>
-      <w:proofErr w:type="spellStart"/>
-      <w:r>
-        <w:rPr>
-          <w:rFonts w:ascii="Times New Roman" w:eastAsia="Times New Roman" w:hAnsi="Times New Roman" w:cs="Times New Roman"/>
-          <w:sz w:val="28"/>
-          <w:szCs w:val="28"/>
-        </w:rPr>
-        <w:t>aria-label</w:t>
-      </w:r>
-      <w:proofErr w:type="spellEnd"/>
-      <w:r>
-        <w:rPr>
-          <w:rFonts w:ascii="Times New Roman" w:eastAsia="Times New Roman" w:hAnsi="Times New Roman" w:cs="Times New Roman"/>
-          <w:sz w:val="28"/>
-          <w:szCs w:val="28"/>
-        </w:rPr>
-        <w:t xml:space="preserve"> и </w:t>
-      </w:r>
-      <w:proofErr w:type="spellStart"/>
-      <w:r>
-        <w:rPr>
-          <w:rFonts w:ascii="Times New Roman" w:eastAsia="Times New Roman" w:hAnsi="Times New Roman" w:cs="Times New Roman"/>
-          <w:sz w:val="28"/>
-          <w:szCs w:val="28"/>
-        </w:rPr>
-        <w:t>aria-pressed</w:t>
-      </w:r>
-      <w:proofErr w:type="spellEnd"/>
-      <w:r>
-        <w:rPr>
-          <w:rFonts w:ascii="Times New Roman" w:eastAsia="Times New Roman" w:hAnsi="Times New Roman" w:cs="Times New Roman"/>
-          <w:sz w:val="28"/>
-          <w:szCs w:val="28"/>
-        </w:rPr>
-        <w:t xml:space="preserve">, для уведомлений правильно переключается </w:t>
-      </w:r>
-      <w:proofErr w:type="spellStart"/>
-      <w:r>
-        <w:rPr>
-          <w:rFonts w:ascii="Times New Roman" w:eastAsia="Times New Roman" w:hAnsi="Times New Roman" w:cs="Times New Roman"/>
-          <w:sz w:val="28"/>
-          <w:szCs w:val="28"/>
-        </w:rPr>
-        <w:t>aria-hidden</w:t>
-      </w:r>
-      <w:proofErr w:type="spellEnd"/>
-      <w:r>
-        <w:rPr>
-          <w:rFonts w:ascii="Times New Roman" w:eastAsia="Times New Roman" w:hAnsi="Times New Roman" w:cs="Times New Roman"/>
-          <w:sz w:val="28"/>
-          <w:szCs w:val="28"/>
-        </w:rPr>
-        <w:t xml:space="preserve">, а для кнопок с долгими действиями устанавливается </w:t>
-      </w:r>
-      <w:proofErr w:type="spellStart"/>
-      <w:r>
-        <w:rPr>
-          <w:rFonts w:ascii="Times New Roman" w:eastAsia="Times New Roman" w:hAnsi="Times New Roman" w:cs="Times New Roman"/>
-          <w:sz w:val="28"/>
-          <w:szCs w:val="28"/>
-        </w:rPr>
-        <w:t>aria-busy</w:t>
-      </w:r>
-      <w:proofErr w:type="spellEnd"/>
-      <w:r>
-        <w:rPr>
-          <w:rFonts w:ascii="Times New Roman" w:eastAsia="Times New Roman" w:hAnsi="Times New Roman" w:cs="Times New Roman"/>
-          <w:sz w:val="28"/>
-          <w:szCs w:val="28"/>
-        </w:rPr>
-        <w:t xml:space="preserve">. В </w:t>
-      </w:r>
-      <w:proofErr w:type="spellStart"/>
-      <w:r>
-        <w:rPr>
-          <w:rFonts w:ascii="Times New Roman" w:eastAsia="Times New Roman" w:hAnsi="Times New Roman" w:cs="Times New Roman"/>
-          <w:sz w:val="28"/>
-          <w:szCs w:val="28"/>
-        </w:rPr>
-        <w:t>рендерах</w:t>
-      </w:r>
-      <w:proofErr w:type="spellEnd"/>
-      <w:r>
-        <w:rPr>
-          <w:rFonts w:ascii="Times New Roman" w:eastAsia="Times New Roman" w:hAnsi="Times New Roman" w:cs="Times New Roman"/>
-          <w:sz w:val="28"/>
-          <w:szCs w:val="28"/>
-        </w:rPr>
-        <w:t xml:space="preserve"> </w:t>
-      </w:r>
-      <w:proofErr w:type="spellStart"/>
-      <w:r>
-        <w:rPr>
-          <w:rFonts w:ascii="Times New Roman" w:eastAsia="Times New Roman" w:hAnsi="Times New Roman" w:cs="Times New Roman"/>
-          <w:sz w:val="28"/>
-          <w:szCs w:val="28"/>
-        </w:rPr>
-        <w:t>dashboard</w:t>
-      </w:r>
-      <w:proofErr w:type="spellEnd"/>
-      <w:r>
-        <w:rPr>
-          <w:rFonts w:ascii="Times New Roman" w:eastAsia="Times New Roman" w:hAnsi="Times New Roman" w:cs="Times New Roman"/>
-          <w:sz w:val="28"/>
-          <w:szCs w:val="28"/>
-        </w:rPr>
-        <w:t xml:space="preserve">, </w:t>
-      </w:r>
-      <w:proofErr w:type="spellStart"/>
-      <w:r>
-        <w:rPr>
-          <w:rFonts w:ascii="Times New Roman" w:eastAsia="Times New Roman" w:hAnsi="Times New Roman" w:cs="Times New Roman"/>
-          <w:sz w:val="28"/>
-          <w:szCs w:val="28"/>
-        </w:rPr>
-        <w:t>reports</w:t>
-      </w:r>
-      <w:proofErr w:type="spellEnd"/>
-      <w:r>
-        <w:rPr>
-          <w:rFonts w:ascii="Times New Roman" w:eastAsia="Times New Roman" w:hAnsi="Times New Roman" w:cs="Times New Roman"/>
-          <w:sz w:val="28"/>
-          <w:szCs w:val="28"/>
-        </w:rPr>
-        <w:t xml:space="preserve"> и </w:t>
-      </w:r>
-      <w:proofErr w:type="spellStart"/>
-      <w:r>
-        <w:rPr>
-          <w:rFonts w:ascii="Times New Roman" w:eastAsia="Times New Roman" w:hAnsi="Times New Roman" w:cs="Times New Roman"/>
-          <w:sz w:val="28"/>
-          <w:szCs w:val="28"/>
-        </w:rPr>
-        <w:t>integrations</w:t>
-      </w:r>
-      <w:proofErr w:type="spellEnd"/>
-      <w:r>
-        <w:rPr>
-          <w:rFonts w:ascii="Times New Roman" w:eastAsia="Times New Roman" w:hAnsi="Times New Roman" w:cs="Times New Roman"/>
-          <w:sz w:val="28"/>
-          <w:szCs w:val="28"/>
-        </w:rPr>
-        <w:t xml:space="preserve"> добавил </w:t>
-      </w:r>
-      <w:proofErr w:type="spellStart"/>
-      <w:r>
-        <w:rPr>
-          <w:rFonts w:ascii="Times New Roman" w:eastAsia="Times New Roman" w:hAnsi="Times New Roman" w:cs="Times New Roman"/>
-          <w:sz w:val="28"/>
-          <w:szCs w:val="28"/>
-        </w:rPr>
-        <w:t>aria</w:t>
-      </w:r>
-      <w:proofErr w:type="spellEnd"/>
-      <w:r>
-        <w:rPr>
-          <w:rFonts w:ascii="Times New Roman" w:eastAsia="Times New Roman" w:hAnsi="Times New Roman" w:cs="Times New Roman"/>
-          <w:sz w:val="28"/>
-          <w:szCs w:val="28"/>
-        </w:rPr>
-        <w:t>-атрибуты прямо в создаваемую разметку</w:t>
+        <w:t xml:space="preserve"> не терялась после динамической перерисовки. Для кнопки показа пароля теперь обновляются aria-label и aria-pressed, для уведомлений правильно переключается aria-hidden, а для кнопок с долгими действиями устанавливается aria-busy. В рендерах dashboard, reports и integrations добавил aria-атрибуты прямо в создаваемую разметку</w:t>
       </w:r>
     </w:p>
     <w:p>
@@ -2500,25 +1210,7 @@
           <w:sz w:val="28"/>
           <w:szCs w:val="28"/>
         </w:rPr>
-        <w:t xml:space="preserve"> Google </w:t>
-      </w:r>
-      <w:proofErr w:type="spellStart"/>
-      <w:r>
-        <w:rPr>
-          <w:rFonts w:ascii="Times New Roman" w:eastAsia="Times New Roman" w:hAnsi="Times New Roman" w:cs="Times New Roman"/>
-          <w:sz w:val="28"/>
-          <w:szCs w:val="28"/>
-        </w:rPr>
-        <w:t>Lighthouse</w:t>
-      </w:r>
-      <w:proofErr w:type="spellEnd"/>
-      <w:r>
-        <w:rPr>
-          <w:rFonts w:ascii="Times New Roman" w:eastAsia="Times New Roman" w:hAnsi="Times New Roman" w:cs="Times New Roman"/>
-          <w:sz w:val="28"/>
-          <w:szCs w:val="28"/>
-        </w:rPr>
-        <w:t xml:space="preserve"> </w:t>
+        <w:t xml:space="preserve"> Google Lighthouse </w:t>
       </w:r>
       <w:r>
         <w:rPr>
@@ -2528,6 +1220,145 @@
         </w:rPr>
         <w:t>и получил хорошие результаты</w:t>
       </w:r>
+      <w:r>
+        <w:rPr>
+          <w:rFonts w:ascii="Times New Roman" w:eastAsia="Times New Roman" w:hAnsi="Times New Roman" w:cs="Times New Roman"/>
+          <w:sz w:val="28"/>
+          <w:szCs w:val="28"/>
+        </w:rPr>
+        <w:t xml:space="preserve"> по доступности</w:t>
+      </w:r>
+    </w:p>
+    <w:p>
+      <w:pPr>
+        <w:pStyle w:val="Body"/>
+        <w:spacing w:before="240"/>
+        <w:rPr>
+          <w:rFonts w:ascii="Times New Roman" w:eastAsia="Times New Roman" w:hAnsi="Times New Roman" w:cs="Times New Roman"/>
+          <w:sz w:val="28"/>
+          <w:szCs w:val="28"/>
+        </w:rPr>
+      </w:pPr>
+      <w:r>
+        <w:rPr>
+          <w:rFonts w:ascii="Times New Roman" w:eastAsia="Times New Roman" w:hAnsi="Times New Roman" w:cs="Times New Roman"/>
+          <w:noProof/>
+          <w:sz w:val="28"/>
+          <w:szCs w:val="28"/>
+          <w14:textOutline w14:w="0" w14:cap="rnd" w14:cmpd="sng" w14:algn="ctr">
+            <w14:noFill/>
+            <w14:prstDash w14:val="solid"/>
+            <w14:bevel/>
+          </w14:textOutline>
+        </w:rPr>
+        <w:lastRenderedPageBreak/>
+        <w:drawing>
+          <wp:inline distT="0" distB="0" distL="0" distR="0">
+            <wp:extent cx="5727700" cy="3181985"/>
+            <wp:effectExtent l="0" t="0" r="0" b="5715"/>
+            <wp:docPr id="1095980766" name="Picture 1"/>
+            <wp:cNvGraphicFramePr>
+              <a:graphicFrameLocks xmlns:a="http://schemas.openxmlformats.org/drawingml/2006/main" noChangeAspect="1"/>
+            </wp:cNvGraphicFramePr>
+            <a:graphic xmlns:a="http://schemas.openxmlformats.org/drawingml/2006/main">
+              <a:graphicData uri="http://schemas.openxmlformats.org/drawingml/2006/picture">
+                <pic:pic xmlns:pic="http://schemas.openxmlformats.org/drawingml/2006/picture">
+                  <pic:nvPicPr>
+                    <pic:cNvPr id="1095980766" name="Picture 1095980766"/>
+                    <pic:cNvPicPr/>
+                  </pic:nvPicPr>
+                  <pic:blipFill>
+                    <a:blip r:embed="rId7" cstate="print">
+                      <a:extLst>
+                        <a:ext uri="{28A0092B-C50C-407E-A947-70E740481C1C}">
+                          <a14:useLocalDpi xmlns:a14="http://schemas.microsoft.com/office/drawing/2010/main" val="0"/>
+                        </a:ext>
+                      </a:extLst>
+                    </a:blip>
+                    <a:stretch>
+                      <a:fillRect/>
+                    </a:stretch>
+                  </pic:blipFill>
+                  <pic:spPr>
+                    <a:xfrm>
+                      <a:off x="0" y="0"/>
+                      <a:ext cx="5727700" cy="3181985"/>
+                    </a:xfrm>
+                    <a:prstGeom prst="rect">
+                      <a:avLst/>
+                    </a:prstGeom>
+                  </pic:spPr>
+                </pic:pic>
+              </a:graphicData>
+            </a:graphic>
+          </wp:inline>
+        </w:drawing>
+      </w:r>
+      <w:r>
+        <w:rPr>
+          <w:rFonts w:ascii="Times New Roman" w:eastAsia="Times New Roman" w:hAnsi="Times New Roman" w:cs="Times New Roman"/>
+          <w:noProof/>
+          <w:sz w:val="28"/>
+          <w:szCs w:val="28"/>
+          <w14:textOutline w14:w="0" w14:cap="rnd" w14:cmpd="sng" w14:algn="ctr">
+            <w14:noFill/>
+            <w14:prstDash w14:val="solid"/>
+            <w14:bevel/>
+          </w14:textOutline>
+        </w:rPr>
+        <w:drawing>
+          <wp:inline distT="0" distB="0" distL="0" distR="0">
+            <wp:extent cx="5727700" cy="3181985"/>
+            <wp:effectExtent l="0" t="0" r="0" b="5715"/>
+            <wp:docPr id="1873804870" name="Picture 2"/>
+            <wp:cNvGraphicFramePr>
+              <a:graphicFrameLocks xmlns:a="http://schemas.openxmlformats.org/drawingml/2006/main" noChangeAspect="1"/>
+            </wp:cNvGraphicFramePr>
+            <a:graphic xmlns:a="http://schemas.openxmlformats.org/drawingml/2006/main">
+              <a:graphicData uri="http://schemas.openxmlformats.org/drawingml/2006/picture">
+                <pic:pic xmlns:pic="http://schemas.openxmlformats.org/drawingml/2006/picture">
+                  <pic:nvPicPr>
+                    <pic:cNvPr id="1873804870" name="Picture 1873804870"/>
+                    <pic:cNvPicPr/>
+                  </pic:nvPicPr>
+                  <pic:blipFill>
+                    <a:blip r:embed="rId8" cstate="print">
+                      <a:extLst>
+                        <a:ext uri="{28A0092B-C50C-407E-A947-70E740481C1C}">
+                          <a14:useLocalDpi xmlns:a14="http://schemas.microsoft.com/office/drawing/2010/main" val="0"/>
+                        </a:ext>
+                      </a:extLst>
+                    </a:blip>
+                    <a:stretch>
+                      <a:fillRect/>
+                    </a:stretch>
+                  </pic:blipFill>
+                  <pic:spPr>
+                    <a:xfrm>
+                      <a:off x="0" y="0"/>
+                      <a:ext cx="5727700" cy="3181985"/>
+                    </a:xfrm>
+                    <a:prstGeom prst="rect">
+                      <a:avLst/>
+                    </a:prstGeom>
+                  </pic:spPr>
+                </pic:pic>
+              </a:graphicData>
+            </a:graphic>
+          </wp:inline>
+        </w:drawing>
+      </w:r>
+    </w:p>
+    <w:p>
+      <w:pPr>
+        <w:pStyle w:val="Body"/>
+        <w:spacing w:before="240"/>
+        <w:rPr>
+          <w:rFonts w:ascii="Times New Roman" w:eastAsia="Times New Roman" w:hAnsi="Times New Roman" w:cs="Times New Roman"/>
+          <w:sz w:val="28"/>
+          <w:szCs w:val="28"/>
+        </w:rPr>
+      </w:pPr>
     </w:p>
     <w:p>
       <w:pPr>
@@ -2629,79 +1460,7 @@
           <w:sz w:val="28"/>
           <w:szCs w:val="28"/>
         </w:rPr>
-        <w:t xml:space="preserve">В итоге доступность сайта </w:t>
-      </w:r>
-      <w:proofErr w:type="spellStart"/>
-      <w:r>
-        <w:rPr>
-          <w:rFonts w:ascii="Times New Roman" w:hAnsi="Times New Roman"/>
-          <w:sz w:val="28"/>
-          <w:szCs w:val="28"/>
-        </w:rPr>
-        <w:t>FinFlow</w:t>
-      </w:r>
-      <w:proofErr w:type="spellEnd"/>
-      <w:r>
-        <w:rPr>
-          <w:rFonts w:ascii="Times New Roman" w:hAnsi="Times New Roman"/>
-          <w:sz w:val="28"/>
-          <w:szCs w:val="28"/>
-        </w:rPr>
-        <w:t xml:space="preserve"> была заметно улучшена без перестройки общей структуры проекта. На всех основных страницах были добавлены </w:t>
-      </w:r>
-      <w:proofErr w:type="spellStart"/>
-      <w:r>
-        <w:rPr>
-          <w:rFonts w:ascii="Times New Roman" w:hAnsi="Times New Roman"/>
-          <w:sz w:val="28"/>
-          <w:szCs w:val="28"/>
-        </w:rPr>
-        <w:t>skip-link</w:t>
-      </w:r>
-      <w:proofErr w:type="spellEnd"/>
-      <w:r>
-        <w:rPr>
-          <w:rFonts w:ascii="Times New Roman" w:hAnsi="Times New Roman"/>
-          <w:sz w:val="28"/>
-          <w:szCs w:val="28"/>
-        </w:rPr>
-        <w:t xml:space="preserve">, </w:t>
-      </w:r>
-      <w:proofErr w:type="spellStart"/>
-      <w:r>
-        <w:rPr>
-          <w:rFonts w:ascii="Times New Roman" w:hAnsi="Times New Roman"/>
-          <w:sz w:val="28"/>
-          <w:szCs w:val="28"/>
-        </w:rPr>
-        <w:t>landmark</w:t>
-      </w:r>
-      <w:proofErr w:type="spellEnd"/>
-      <w:r>
-        <w:rPr>
-          <w:rFonts w:ascii="Times New Roman" w:hAnsi="Times New Roman"/>
-          <w:sz w:val="28"/>
-          <w:szCs w:val="28"/>
-        </w:rPr>
-        <w:t xml:space="preserve">-области, </w:t>
-      </w:r>
-      <w:proofErr w:type="spellStart"/>
-      <w:r>
-        <w:rPr>
-          <w:rFonts w:ascii="Times New Roman" w:hAnsi="Times New Roman"/>
-          <w:sz w:val="28"/>
-          <w:szCs w:val="28"/>
-        </w:rPr>
-        <w:t>aria</w:t>
-      </w:r>
-      <w:proofErr w:type="spellEnd"/>
-      <w:r>
-        <w:rPr>
-          <w:rFonts w:ascii="Times New Roman" w:hAnsi="Times New Roman"/>
-          <w:sz w:val="28"/>
-          <w:szCs w:val="28"/>
-        </w:rPr>
-        <w:t>-атрибуты для навигации, форм</w:t>
+        <w:t>В итоге доступность сайта FinFlow была заметно улучшена без перестройки общей структуры проекта. На всех основных страницах были добавлены skip-link, landmark-области, aria-атрибуты для навигации, форм</w:t>
       </w:r>
       <w:r>
         <w:rPr>
@@ -2717,30 +1476,12 @@
           <w:sz w:val="28"/>
           <w:szCs w:val="28"/>
         </w:rPr>
-        <w:t xml:space="preserve">Автоматическая проверка через Google </w:t>
-      </w:r>
-      <w:proofErr w:type="spellStart"/>
-      <w:r>
-        <w:rPr>
-          <w:rFonts w:ascii="Times New Roman" w:hAnsi="Times New Roman"/>
-          <w:sz w:val="28"/>
-          <w:szCs w:val="28"/>
-        </w:rPr>
-        <w:t>Lighthouse</w:t>
-      </w:r>
-      <w:proofErr w:type="spellEnd"/>
-      <w:r>
-        <w:rPr>
-          <w:rFonts w:ascii="Times New Roman" w:hAnsi="Times New Roman"/>
-          <w:sz w:val="28"/>
-          <w:szCs w:val="28"/>
-        </w:rPr>
-        <w:t xml:space="preserve"> показала 100 баллов</w:t>
+        <w:t>Автоматическая проверка через Google Lighthouse показала 100 баллов</w:t>
       </w:r>
     </w:p>
     <w:sectPr>
-      <w:headerReference w:type="default" r:id="rId7"/>
-      <w:footerReference w:type="default" r:id="rId8"/>
+      <w:headerReference w:type="default" r:id="rId9"/>
+      <w:footerReference w:type="default" r:id="rId10"/>
       <w:pgSz w:w="11900" w:h="16840"/>
       <w:pgMar w:top="1440" w:right="1440" w:bottom="1440" w:left="1440" w:header="720" w:footer="720" w:gutter="0"/>
       <w:pgNumType w:start="1"/>

</xml_diff>